<commit_message>
Update resume for database administration and align career history
</commit_message>
<xml_diff>
--- a/Richard-Jones-resume.docx
+++ b/Richard-Jones-resume.docx
@@ -4,764 +4,414 @@
   <w:body>
     <w:p>
       <w:pPr>
-        <w:spacing w:before="0" w:after="20" w:line="240" w:lineRule="auto"/>
-        <w:jc w:val="left"/>
+        <w:pStyle w:val="Title"/>
       </w:pPr>
       <w:r>
-        <w:rPr>
-          <w:rFonts w:ascii="Aptos" w:hAnsi="Aptos"/>
-          <w:b/>
-          <w:i w:val="0"/>
-          <w:color w:val="16304A"/>
-          <w:sz w:val="48"/>
-        </w:rPr>
         <w:t>RICHARD JONES</w:t>
       </w:r>
     </w:p>
     <w:p>
-      <w:pPr>
-        <w:spacing w:before="0" w:after="60" w:line="240" w:lineRule="auto"/>
-      </w:pPr>
       <w:r>
         <w:rPr>
-          <w:rFonts w:ascii="Aptos" w:hAnsi="Aptos"/>
           <w:b/>
-          <w:i w:val="0"/>
-          <w:color w:val="00707D"/>
-          <w:sz w:val="23"/>
         </w:rPr>
-        <w:t>Senior Full-Stack Engineer | AI Agents and Workflow Automation</w:t>
+        <w:t>Database Administration | Data Engineering | Analytics</w:t>
+      </w:r>
+    </w:p>
+    <w:p>
+      <w:r>
+        <w:t>Phoenix, AZ | (415) 697-4734 | RichardX13@gmail.com</w:t>
+      </w:r>
+    </w:p>
+    <w:p>
+      <w:r>
+        <w:t>linkedin.com/in/richardjones2020 | shoegun.github.io</w:t>
       </w:r>
     </w:p>
     <w:p>
       <w:pPr>
-        <w:spacing w:before="0" w:after="160" w:line="240" w:lineRule="auto"/>
+        <w:pStyle w:val="Heading1"/>
       </w:pPr>
       <w:r>
-        <w:rPr>
-          <w:rFonts w:ascii="Aptos" w:hAnsi="Aptos"/>
-          <w:b w:val="0"/>
-          <w:i w:val="0"/>
-          <w:color w:val="5B6773"/>
-          <w:sz w:val="17"/>
-        </w:rPr>
-        <w:t>Phoenix, AZ  |  (415) 697-4734  |  RichardX13@gmail.com  |  linkedin.com/in/richardjones2020</w:t>
+        <w:t>Profile</w:t>
+      </w:r>
+    </w:p>
+    <w:p>
+      <w:r>
+        <w:t>Database and data operations professional with hands-on experience maintaining production PostgreSQL on AWS RDS, reconciling business-critical data, and administering database backups, recovery, and access controls. Uses SQL, Python, and reporting tools to investigate issues, automate work, and improve data reliability. Career since 2003 spans banking operations, workforce analytics, business ownership, consulting, and software engineering.</w:t>
       </w:r>
     </w:p>
     <w:p>
       <w:pPr>
-        <w:spacing w:before="160" w:after="60" w:line="240" w:lineRule="auto"/>
-        <w:pBdr>
-          <w:bottom w:val="single" w:sz="10" w:space="1" w:color="00707D"/>
-        </w:pBdr>
+        <w:pStyle w:val="Heading1"/>
       </w:pPr>
       <w:r>
+        <w:t>Core skills</w:t>
+      </w:r>
+    </w:p>
+    <w:p>
+      <w:r>
         <w:rPr>
-          <w:rFonts w:ascii="Aptos" w:hAnsi="Aptos"/>
           <w:b/>
-          <w:i w:val="0"/>
-          <w:color w:val="00707D"/>
-          <w:sz w:val="21"/>
         </w:rPr>
-        <w:t>ENGINEERING PROFILE</w:t>
+        <w:t xml:space="preserve">Databases and operations: </w:t>
+      </w:r>
+      <w:r>
+        <w:t>PostgreSQL, AWS RDS, MySQL, psql, phpMyAdmin, SQL, data modeling, production reconciliation, transaction safeguards, backup and recovery, access controls.</w:t>
+      </w:r>
+    </w:p>
+    <w:p>
+      <w:r>
+        <w:rPr>
+          <w:b/>
+        </w:rPr>
+        <w:t xml:space="preserve">Engineering and analytics: </w:t>
+      </w:r>
+      <w:r>
+        <w:t>Python, Ruby, Linux/SSH, Hive/HiveQL, Apache Spark, Piper, RStudio, Jupyter, ETL pipelines, standardized analytical queries, Tableau, Power BI, Grafana.</w:t>
+      </w:r>
+    </w:p>
+    <w:p>
+      <w:r>
+        <w:rPr>
+          <w:b/>
+        </w:rPr>
+        <w:t xml:space="preserve">Cloud and delivery: </w:t>
+      </w:r>
+      <w:r>
+        <w:t>AWS storage and backups, GCP IAM, application permissions, Next.js, cross-functional delivery, migration support, HIPAA requirements and HITRUST e1 certification efforts.</w:t>
       </w:r>
     </w:p>
     <w:p>
       <w:pPr>
-        <w:spacing w:before="0" w:after="100" w:line="259" w:lineRule="auto"/>
+        <w:pStyle w:val="Heading1"/>
       </w:pPr>
       <w:r>
-        <w:rPr>
-          <w:rFonts w:ascii="Aptos" w:hAnsi="Aptos"/>
-          <w:b w:val="0"/>
-          <w:i w:val="0"/>
-          <w:color w:val="262D34"/>
-          <w:sz w:val="19"/>
-        </w:rPr>
-        <w:t>Senior engineer and analytics specialist who turns ambiguous requirements into reliable data products, full-stack applications, and practical AI workflows. Experienced across React, Node.js, TypeScript, Python, PostgreSQL, AWS serverless systems, LLM integration, structured extraction, evaluation, and operational analytics. Known for making complex systems explainable, testable, and useful to the people who depend on them.</w:t>
+        <w:t>Recent experience</w:t>
       </w:r>
     </w:p>
     <w:p>
       <w:pPr>
-        <w:spacing w:before="160" w:after="60" w:line="240" w:lineRule="auto"/>
-        <w:pBdr>
-          <w:bottom w:val="single" w:sz="10" w:space="1" w:color="00707D"/>
-        </w:pBdr>
+        <w:pStyle w:val="Heading2"/>
       </w:pPr>
       <w:r>
-        <w:rPr>
-          <w:rFonts w:ascii="Aptos" w:hAnsi="Aptos"/>
-          <w:b/>
-          <w:i w:val="0"/>
-          <w:color w:val="00707D"/>
-          <w:sz w:val="21"/>
-        </w:rPr>
-        <w:t>CORE EXPERTISE</w:t>
+        <w:t>Reciprocity Health / Clutch | Software Engineer | Database and Data Operations</w:t>
       </w:r>
     </w:p>
     <w:p>
       <w:pPr>
-        <w:spacing w:before="0" w:after="100" w:line="252" w:lineRule="auto"/>
+        <w:keepNext/>
       </w:pPr>
       <w:r>
-        <w:rPr>
-          <w:rFonts w:ascii="Aptos" w:hAnsi="Aptos"/>
-          <w:b/>
-          <w:i w:val="0"/>
-          <w:color w:val="16304A"/>
-          <w:sz w:val="19"/>
-        </w:rPr>
-        <w:t xml:space="preserve">Full stack: </w:t>
-      </w:r>
-      <w:r>
-        <w:rPr>
-          <w:rFonts w:ascii="Aptos" w:hAnsi="Aptos"/>
-          <w:b w:val="0"/>
-          <w:i w:val="0"/>
-          <w:color w:val="262D34"/>
-          <w:sz w:val="19"/>
-        </w:rPr>
-        <w:t>React, TypeScript, JavaScript, Node.js, Next.js, REST APIs, Python, PostgreSQL, MySQL, testing</w:t>
-        <w:br/>
-      </w:r>
-      <w:r>
-        <w:rPr>
-          <w:rFonts w:ascii="Aptos" w:hAnsi="Aptos"/>
-          <w:b/>
-          <w:i w:val="0"/>
-          <w:color w:val="16304A"/>
-          <w:sz w:val="19"/>
-        </w:rPr>
-        <w:t xml:space="preserve">AI and data: </w:t>
-      </w:r>
-      <w:r>
-        <w:rPr>
-          <w:rFonts w:ascii="Aptos" w:hAnsi="Aptos"/>
-          <w:b w:val="0"/>
-          <w:i w:val="0"/>
-          <w:color w:val="262D34"/>
-          <w:sz w:val="19"/>
-        </w:rPr>
-        <w:t>AI agents, LLM integration, RAG, tool calling, structured outputs, evals, red teaming, SQL, Spark, Hive, ETL/ELT, data modeling, validation</w:t>
-        <w:br/>
-      </w:r>
-      <w:r>
-        <w:rPr>
-          <w:rFonts w:ascii="Aptos" w:hAnsi="Aptos"/>
-          <w:b/>
-          <w:i w:val="0"/>
-          <w:color w:val="16304A"/>
-          <w:sz w:val="19"/>
-        </w:rPr>
-        <w:t xml:space="preserve">Cloud and delivery: </w:t>
-      </w:r>
-      <w:r>
-        <w:rPr>
-          <w:rFonts w:ascii="Aptos" w:hAnsi="Aptos"/>
-          <w:b w:val="0"/>
-          <w:i w:val="0"/>
-          <w:color w:val="262D34"/>
-          <w:sz w:val="19"/>
-        </w:rPr>
-        <w:t>AWS Lambda, API Gateway, DynamoDB, S3, serverless workflows, monitoring, alerting, incident triage, Grafana, Tableau, Power BI</w:t>
+        <w:t>Feb 2025 - Dec 2025 | Remote</w:t>
       </w:r>
     </w:p>
     <w:p>
       <w:pPr>
-        <w:spacing w:before="160" w:after="60" w:line="240" w:lineRule="auto"/>
-        <w:pBdr>
-          <w:bottom w:val="single" w:sz="10" w:space="1" w:color="00707D"/>
-        </w:pBdr>
+        <w:pStyle w:val="ListBullet"/>
+        <w:spacing w:after="80"/>
       </w:pPr>
       <w:r>
-        <w:rPr>
-          <w:rFonts w:ascii="Aptos" w:hAnsi="Aptos"/>
-          <w:b/>
-          <w:i w:val="0"/>
-          <w:color w:val="00707D"/>
-          <w:sz w:val="21"/>
-        </w:rPr>
-        <w:t>PROFESSIONAL EXPERIENCE</w:t>
+        <w:t>Maintained production PostgreSQL on AWS RDS for TheraPay. Investigated and reconciled member eligibility, enrollment, and rewards-processing data using psql, SQL, Python, and Ruby.</w:t>
       </w:r>
     </w:p>
     <w:p>
       <w:pPr>
-        <w:spacing w:before="100" w:after="20" w:line="240" w:lineRule="auto"/>
+        <w:pStyle w:val="ListBullet"/>
+        <w:spacing w:after="80"/>
       </w:pPr>
       <w:r>
-        <w:rPr>
-          <w:rFonts w:ascii="Aptos" w:hAnsi="Aptos"/>
-          <w:b/>
-          <w:i w:val="0"/>
-          <w:color w:val="16304A"/>
-          <w:sz w:val="21"/>
-        </w:rPr>
-        <w:t>Independent Consulting - AI Integration / Full-Stack Engineer</w:t>
-      </w:r>
-      <w:r>
-        <w:rPr>
-          <w:rFonts w:ascii="Aptos" w:hAnsi="Aptos"/>
-          <w:b w:val="0"/>
-          <w:i w:val="0"/>
-          <w:color w:val="5B6773"/>
-          <w:sz w:val="18"/>
-        </w:rPr>
-        <w:t xml:space="preserve">  |  2020 - Present  |  Phoenix, AZ / Remote</w:t>
+        <w:t>Performed controlled corrections and reprocessing with transaction safeguards and before-and-after validation; investigated discrepancies affecting operational reporting and downstream processing.</w:t>
       </w:r>
     </w:p>
     <w:p>
       <w:pPr>
-        <w:pStyle w:val="ResumeBullet"/>
-        <w:spacing w:before="0" w:after="30" w:line="240" w:lineRule="auto"/>
+        <w:pStyle w:val="ListBullet"/>
+        <w:spacing w:after="80"/>
       </w:pPr>
       <w:r>
-        <w:rPr>
-          <w:rFonts w:ascii="Aptos" w:hAnsi="Aptos"/>
-          <w:b w:val="0"/>
-          <w:i w:val="0"/>
-          <w:color w:val="262D34"/>
-          <w:sz w:val="18"/>
-        </w:rPr>
-        <w:t>Architected and delivered an LLM-assisted legal-document review workflow that reduced manual review time by approximately 4x while preserving human-review checkpoints.</w:t>
+        <w:t>Maintained and modernized a Next.js monorepo while supporting HIPAA requirements and HITRUST e1 certification efforts.</w:t>
       </w:r>
     </w:p>
     <w:p>
       <w:pPr>
-        <w:pStyle w:val="ResumeBullet"/>
-        <w:spacing w:before="0" w:after="30" w:line="240" w:lineRule="auto"/>
+        <w:pStyle w:val="ListBullet"/>
+        <w:spacing w:after="80"/>
       </w:pPr>
       <w:r>
-        <w:rPr>
-          <w:rFonts w:ascii="Aptos" w:hAnsi="Aptos"/>
-          <w:b w:val="0"/>
-          <w:i w:val="0"/>
-          <w:color w:val="262D34"/>
-          <w:sz w:val="18"/>
-        </w:rPr>
-        <w:t>Built React, Node.js, TypeScript, and Python applications connecting document intake, RAG, structured extraction, APIs, databases, and reviewer workflows.</w:t>
+        <w:t>Following Clutch's acquisition of Reciprocity Health in 2025, completed a major migration, improved code and processes, and transferred lead-engineering responsibilities to Clutch's team.</w:t>
       </w:r>
     </w:p>
     <w:p>
       <w:pPr>
-        <w:pStyle w:val="ResumeBullet"/>
-        <w:spacing w:before="0" w:after="30" w:line="240" w:lineRule="auto"/>
+        <w:pStyle w:val="Heading2"/>
       </w:pPr>
       <w:r>
-        <w:rPr>
-          <w:rFonts w:ascii="Aptos" w:hAnsi="Aptos"/>
-          <w:b w:val="0"/>
-          <w:i w:val="0"/>
-          <w:color w:val="262D34"/>
-          <w:sz w:val="18"/>
-        </w:rPr>
-        <w:t>Designed agent workflows for routing, tool use, structured outputs, model handoffs, human approval, evaluation, and red-team testing.</w:t>
+        <w:t>Independent Consulting | Analytics, Software Development and AI Integration</w:t>
       </w:r>
     </w:p>
     <w:p>
       <w:pPr>
-        <w:pStyle w:val="ResumeBullet"/>
-        <w:spacing w:before="0" w:after="30" w:line="240" w:lineRule="auto"/>
+        <w:keepNext/>
       </w:pPr>
       <w:r>
-        <w:rPr>
-          <w:rFonts w:ascii="Aptos" w:hAnsi="Aptos"/>
-          <w:b w:val="0"/>
-          <w:i w:val="0"/>
-          <w:color w:val="262D34"/>
-          <w:sz w:val="18"/>
-        </w:rPr>
-        <w:t>Delivered paralegal and legal-technology support, data pipelines, dashboards, websites, branding, and business-development work for small businesses and professional clients.</w:t>
+        <w:t>Sep 2020 - Jan 2025 | Freelance and project-based</w:t>
       </w:r>
     </w:p>
     <w:p>
       <w:pPr>
-        <w:spacing w:before="100" w:after="20" w:line="240" w:lineRule="auto"/>
+        <w:pStyle w:val="ListBullet"/>
+        <w:spacing w:after="80"/>
       </w:pPr>
       <w:r>
-        <w:rPr>
-          <w:rFonts w:ascii="Aptos" w:hAnsi="Aptos"/>
-          <w:b/>
-          <w:i w:val="0"/>
-          <w:color w:val="16304A"/>
-          <w:sz w:val="21"/>
-        </w:rPr>
-        <w:t>Clutch - Data Engineer / Analytics Engineer</w:t>
-      </w:r>
-      <w:r>
-        <w:rPr>
-          <w:rFonts w:ascii="Aptos" w:hAnsi="Aptos"/>
-          <w:b w:val="0"/>
-          <w:i w:val="0"/>
-          <w:color w:val="5B6773"/>
-          <w:sz w:val="18"/>
-        </w:rPr>
-        <w:t xml:space="preserve">  |  Sep 2025 - Dec 2025  |  Remote</w:t>
+        <w:t>Delivered data pipelines, dashboards, full-stack web applications, and business-process automation across independent client projects.</w:t>
       </w:r>
     </w:p>
     <w:p>
       <w:pPr>
-        <w:pStyle w:val="ResumeBullet"/>
-        <w:spacing w:before="0" w:after="30" w:line="240" w:lineRule="auto"/>
+        <w:pStyle w:val="ListBullet"/>
+        <w:spacing w:after="80"/>
       </w:pPr>
       <w:r>
-        <w:rPr>
-          <w:rFonts w:ascii="Aptos" w:hAnsi="Aptos"/>
-          <w:b w:val="0"/>
-          <w:i w:val="0"/>
-          <w:color w:val="262D34"/>
-          <w:sz w:val="18"/>
-        </w:rPr>
-        <w:t>Improved trust in operational dashboards with targeted QA checks and resolved recurring data discrepancies.</w:t>
+        <w:t>Performed legal digital-evidence research, processing, and organization as a paralegal under attorney supervision; developed tools to support evidence review.</w:t>
       </w:r>
     </w:p>
     <w:p>
       <w:pPr>
-        <w:pStyle w:val="ResumeBullet"/>
-        <w:spacing w:before="0" w:after="30" w:line="240" w:lineRule="auto"/>
+        <w:pStyle w:val="ListBullet"/>
+        <w:spacing w:after="80"/>
       </w:pPr>
       <w:r>
-        <w:rPr>
-          <w:rFonts w:ascii="Aptos" w:hAnsi="Aptos"/>
-          <w:b w:val="0"/>
-          <w:i w:val="0"/>
-          <w:color w:val="262D34"/>
-          <w:sz w:val="18"/>
-        </w:rPr>
-        <w:t>Monitored jobs, investigated anomalies, and added validation and alerting safeguards to prevent regressions.</w:t>
+        <w:t>Contributed AI integration and optical character recognition (OCR) to a project for a major financial institution under nondisclosure obligations.</w:t>
       </w:r>
     </w:p>
     <w:p>
       <w:pPr>
-        <w:pStyle w:val="ResumeBullet"/>
-        <w:spacing w:before="0" w:after="30" w:line="240" w:lineRule="auto"/>
+        <w:pStyle w:val="Heading1"/>
       </w:pPr>
       <w:r>
-        <w:rPr>
-          <w:rFonts w:ascii="Aptos" w:hAnsi="Aptos"/>
-          <w:b w:val="0"/>
-          <w:i w:val="0"/>
-          <w:color w:val="262D34"/>
-          <w:sz w:val="18"/>
-        </w:rPr>
-        <w:t>Clarified metric definitions with stakeholders and improved consistency across operational reporting.</w:t>
+        <w:t>Additional recent contract work</w:t>
+      </w:r>
+    </w:p>
+    <w:p>
+      <w:r>
+        <w:t>Configured GCP IAM permissions and application access restrictions for a recent Moody Goose contract sprint supporting driver credential verification.</w:t>
+      </w:r>
+    </w:p>
+    <w:p>
+      <w:r>
+        <w:br w:type="page"/>
       </w:r>
     </w:p>
     <w:p>
       <w:pPr>
-        <w:spacing w:before="100" w:after="20" w:line="240" w:lineRule="auto"/>
+        <w:pStyle w:val="Heading1"/>
       </w:pPr>
       <w:r>
-        <w:rPr>
-          <w:rFonts w:ascii="Aptos" w:hAnsi="Aptos"/>
-          <w:b/>
-          <w:i w:val="0"/>
-          <w:color w:val="16304A"/>
-          <w:sz w:val="21"/>
-        </w:rPr>
-        <w:t>Reciprocity Health (TheraPay) - Data Engineer</w:t>
-      </w:r>
-      <w:r>
-        <w:rPr>
-          <w:rFonts w:ascii="Aptos" w:hAnsi="Aptos"/>
-          <w:b w:val="0"/>
-          <w:i w:val="0"/>
-          <w:color w:val="5B6773"/>
-          <w:sz w:val="18"/>
-        </w:rPr>
-        <w:t xml:space="preserve">  |  Feb 2025 - Aug 2025  |  Remote</w:t>
+        <w:t>Earlier experience</w:t>
       </w:r>
     </w:p>
     <w:p>
       <w:pPr>
-        <w:pStyle w:val="ResumeBullet"/>
-        <w:spacing w:before="0" w:after="30" w:line="240" w:lineRule="auto"/>
+        <w:pStyle w:val="Heading2"/>
       </w:pPr>
       <w:r>
-        <w:rPr>
-          <w:rFonts w:ascii="Aptos" w:hAnsi="Aptos"/>
-          <w:b w:val="0"/>
-          <w:i w:val="0"/>
-          <w:color w:val="262D34"/>
-          <w:sz w:val="18"/>
-        </w:rPr>
-        <w:t>Reconstructed a reliable source of truth across eligibility, completions, rewards, and validation events in fragmented operational tables.</w:t>
+        <w:t>Uber | Global Analyst | New Innovations and Global Analytics</w:t>
       </w:r>
     </w:p>
     <w:p>
       <w:pPr>
-        <w:pStyle w:val="ResumeBullet"/>
-        <w:spacing w:before="0" w:after="30" w:line="240" w:lineRule="auto"/>
+        <w:keepNext/>
       </w:pPr>
       <w:r>
-        <w:rPr>
-          <w:rFonts w:ascii="Aptos" w:hAnsi="Aptos"/>
-          <w:b w:val="0"/>
-          <w:i w:val="0"/>
-          <w:color w:val="262D34"/>
-          <w:sz w:val="18"/>
-        </w:rPr>
-        <w:t>Produced safe, testable remediation scripts with verification checkpoints for backfills, status fixes, and reprocessing readiness.</w:t>
+        <w:t>Feb 2018 - Jul 2020</w:t>
       </w:r>
     </w:p>
     <w:p>
       <w:pPr>
-        <w:pStyle w:val="ResumeBullet"/>
-        <w:spacing w:before="0" w:after="30" w:line="240" w:lineRule="auto"/>
+        <w:pStyle w:val="ListBullet"/>
+        <w:spacing w:after="80"/>
       </w:pPr>
       <w:r>
-        <w:rPr>
-          <w:rFonts w:ascii="Aptos" w:hAnsi="Aptos"/>
-          <w:b w:val="0"/>
-          <w:i w:val="0"/>
-          <w:color w:val="262D34"/>
-          <w:sz w:val="18"/>
-        </w:rPr>
-        <w:t>Delivered Grafana-friendly outputs that accelerated investigations and improved response to member-impacting tickets.</w:t>
+        <w:t>Used PostgreSQL, Hive, Apache Spark, Piper, and RStudio in hands-on global analytics work supporting Greenlight operations, the New Innovations team, and kiosk initiatives.</w:t>
       </w:r>
     </w:p>
     <w:p>
       <w:pPr>
-        <w:spacing w:before="100" w:after="20" w:line="240" w:lineRule="auto"/>
+        <w:pStyle w:val="ListBullet"/>
+        <w:spacing w:after="80"/>
       </w:pPr>
       <w:r>
-        <w:rPr>
-          <w:rFonts w:ascii="Aptos" w:hAnsi="Aptos"/>
-          <w:b/>
-          <w:i w:val="0"/>
-          <w:color w:val="16304A"/>
-          <w:sz w:val="21"/>
-        </w:rPr>
-        <w:t>Uber - Global Analyst, New Ventures / Global Analytics</w:t>
-      </w:r>
-      <w:r>
-        <w:rPr>
-          <w:rFonts w:ascii="Aptos" w:hAnsi="Aptos"/>
-          <w:b w:val="0"/>
-          <w:i w:val="0"/>
-          <w:color w:val="5B6773"/>
-          <w:sz w:val="18"/>
-        </w:rPr>
-        <w:t xml:space="preserve">  |  2018 - 2020  |  San Francisco, CA</w:t>
+        <w:t>Helped design standardized, multidimensional "gold-standard" analytical queries and backend analytics tables, providing consistent definitions and reporting foundations across business groups.</w:t>
       </w:r>
     </w:p>
     <w:p>
       <w:pPr>
-        <w:pStyle w:val="ResumeBullet"/>
-        <w:spacing w:before="0" w:after="30" w:line="240" w:lineRule="auto"/>
+        <w:pStyle w:val="ListBullet"/>
+        <w:spacing w:after="80"/>
       </w:pPr>
       <w:r>
-        <w:rPr>
-          <w:rFonts w:ascii="Aptos" w:hAnsi="Aptos"/>
-          <w:b w:val="0"/>
-          <w:i w:val="0"/>
-          <w:color w:val="262D34"/>
-          <w:sz w:val="18"/>
-        </w:rPr>
-        <w:t>Developed ML models and analytics systems for forecasting, risk assessment, pilot evaluation, and data-driven product decisions.</w:t>
+        <w:t>Built analytical models and dashboards for operational demand, staffing, support costs, and pilot programs; partnered with Operations, Product, and Finance to translate business needs into reporting.</w:t>
       </w:r>
     </w:p>
     <w:p>
       <w:pPr>
-        <w:pStyle w:val="ResumeBullet"/>
-        <w:spacing w:before="0" w:after="30" w:line="240" w:lineRule="auto"/>
+        <w:pStyle w:val="Heading2"/>
       </w:pPr>
       <w:r>
-        <w:rPr>
-          <w:rFonts w:ascii="Aptos" w:hAnsi="Aptos"/>
-          <w:b w:val="0"/>
-          <w:i w:val="0"/>
-          <w:color w:val="262D34"/>
-          <w:sz w:val="18"/>
-        </w:rPr>
-        <w:t>Built ETL, dashboards, SLA monitoring, and operational systems for emerging initiatives, including self-service kiosks and in-car inventory management.</w:t>
+        <w:t>Uber | Operations Specialist</w:t>
       </w:r>
     </w:p>
     <w:p>
       <w:pPr>
-        <w:pStyle w:val="ResumeBullet"/>
-        <w:spacing w:before="0" w:after="30" w:line="240" w:lineRule="auto"/>
+        <w:keepNext/>
       </w:pPr>
       <w:r>
-        <w:rPr>
-          <w:rFonts w:ascii="Aptos" w:hAnsi="Aptos"/>
-          <w:b w:val="0"/>
-          <w:i w:val="0"/>
-          <w:color w:val="262D34"/>
-          <w:sz w:val="18"/>
-        </w:rPr>
-        <w:t>Automated monitoring for greater than 98% uptime targets; risk and performance analysis reduced costs by approximately 30% and improved CSAT by approximately 8%.</w:t>
+        <w:t>Feb 2015 - Feb 2018</w:t>
       </w:r>
     </w:p>
     <w:p>
       <w:pPr>
-        <w:spacing w:before="100" w:after="20" w:line="240" w:lineRule="auto"/>
+        <w:pStyle w:val="ListBullet"/>
+        <w:spacing w:after="80"/>
       </w:pPr>
       <w:r>
-        <w:rPr>
-          <w:rFonts w:ascii="Aptos" w:hAnsi="Aptos"/>
-          <w:b/>
-          <w:i w:val="0"/>
-          <w:color w:val="16304A"/>
-          <w:sz w:val="21"/>
-        </w:rPr>
-        <w:t>Uber - Operations Specialist</w:t>
-      </w:r>
-      <w:r>
-        <w:rPr>
-          <w:rFonts w:ascii="Aptos" w:hAnsi="Aptos"/>
-          <w:b w:val="0"/>
-          <w:i w:val="0"/>
-          <w:color w:val="5B6773"/>
-          <w:sz w:val="18"/>
-        </w:rPr>
-        <w:t xml:space="preserve">  |  2015 - 2018  |  San Francisco, CA</w:t>
+        <w:t>Developed workforce forecasts and operational reporting using R, Python, Jupyter, Google Sheets, and Tableau; supported staffing decisions and process improvements.</w:t>
       </w:r>
     </w:p>
     <w:p>
       <w:pPr>
-        <w:pStyle w:val="ResumeBullet"/>
-        <w:spacing w:before="0" w:after="30" w:line="240" w:lineRule="auto"/>
+        <w:pStyle w:val="Heading2"/>
       </w:pPr>
       <w:r>
-        <w:rPr>
-          <w:rFonts w:ascii="Aptos" w:hAnsi="Aptos"/>
-          <w:b w:val="0"/>
-          <w:i w:val="0"/>
-          <w:color w:val="262D34"/>
-          <w:sz w:val="18"/>
-        </w:rPr>
-        <w:t>Built workforce-planning dashboards and operational reporting to improve SLA compliance.</w:t>
+        <w:t>Uber | Operations Coordinator</w:t>
       </w:r>
     </w:p>
     <w:p>
       <w:pPr>
-        <w:pStyle w:val="ResumeBullet"/>
-        <w:spacing w:before="0" w:after="30" w:line="240" w:lineRule="auto"/>
+        <w:keepNext/>
       </w:pPr>
       <w:r>
-        <w:rPr>
-          <w:rFonts w:ascii="Aptos" w:hAnsi="Aptos"/>
-          <w:b w:val="0"/>
-          <w:i w:val="0"/>
-          <w:color w:val="262D34"/>
-          <w:sz w:val="18"/>
-        </w:rPr>
-        <w:t>Managed partner relationships and translated operational needs into analytics deliverables and process improvements.</w:t>
+        <w:t>Feb 2014 - Jan 2015</w:t>
       </w:r>
     </w:p>
     <w:p>
       <w:pPr>
-        <w:spacing w:before="160" w:after="60" w:line="240" w:lineRule="auto"/>
-        <w:pBdr>
-          <w:bottom w:val="single" w:sz="10" w:space="1" w:color="00707D"/>
-        </w:pBdr>
+        <w:pStyle w:val="ListBullet"/>
+        <w:spacing w:after="80"/>
       </w:pPr>
       <w:r>
-        <w:rPr>
-          <w:rFonts w:ascii="Aptos" w:hAnsi="Aptos"/>
-          <w:b/>
-          <w:i w:val="0"/>
-          <w:color w:val="00707D"/>
-          <w:sz w:val="21"/>
-        </w:rPr>
-        <w:t>ADDITIONAL EXPERIENCE</w:t>
+        <w:t>Supported activation-center operations and reporting with Python, JavaScript, MySQL, Google Apps Script, and SSH-based tools.</w:t>
       </w:r>
     </w:p>
     <w:p>
       <w:pPr>
-        <w:spacing w:before="60" w:after="20" w:line="240" w:lineRule="auto"/>
+        <w:pStyle w:val="Heading2"/>
       </w:pPr>
       <w:r>
-        <w:rPr>
-          <w:rFonts w:ascii="Aptos" w:hAnsi="Aptos"/>
-          <w:b/>
-          <w:i w:val="0"/>
-          <w:color w:val="16304A"/>
-          <w:sz w:val="19"/>
-        </w:rPr>
-        <w:t>Vangent - Government analytics contractor</w:t>
-      </w:r>
-      <w:r>
-        <w:rPr>
-          <w:rFonts w:ascii="Aptos" w:hAnsi="Aptos"/>
-          <w:b w:val="0"/>
-          <w:i w:val="0"/>
-          <w:color w:val="262D34"/>
-          <w:sz w:val="18"/>
-        </w:rPr>
-        <w:t xml:space="preserve"> - Analytics involving Medicare, Medicaid, Faisac, and the CDC</w:t>
+        <w:t>AZ Cloud9 Studios / Cloud 9 Photography | Owner Manager</w:t>
       </w:r>
     </w:p>
     <w:p>
       <w:pPr>
-        <w:spacing w:before="60" w:after="20" w:line="240" w:lineRule="auto"/>
+        <w:keepNext/>
       </w:pPr>
       <w:r>
-        <w:rPr>
-          <w:rFonts w:ascii="Aptos" w:hAnsi="Aptos"/>
-          <w:b/>
-          <w:i w:val="0"/>
-          <w:color w:val="16304A"/>
-          <w:sz w:val="19"/>
-        </w:rPr>
-        <w:t>Bank of America and JPMorgan Chase - Operations and analytics</w:t>
-      </w:r>
-      <w:r>
-        <w:rPr>
-          <w:rFonts w:ascii="Aptos" w:hAnsi="Aptos"/>
-          <w:b w:val="0"/>
-          <w:i w:val="0"/>
-          <w:color w:val="262D34"/>
-          <w:sz w:val="18"/>
-        </w:rPr>
-        <w:t xml:space="preserve"> - Banking, process improvement, reporting, and systems work</w:t>
+        <w:t>Apr 2012 - Dec 2013</w:t>
       </w:r>
     </w:p>
     <w:p>
       <w:pPr>
-        <w:spacing w:before="60" w:after="20" w:line="240" w:lineRule="auto"/>
+        <w:pStyle w:val="ListBullet"/>
+        <w:spacing w:after="80"/>
       </w:pPr>
       <w:r>
-        <w:rPr>
-          <w:rFonts w:ascii="Aptos" w:hAnsi="Aptos"/>
-          <w:b/>
-          <w:i w:val="0"/>
-          <w:color w:val="16304A"/>
-          <w:sz w:val="19"/>
-        </w:rPr>
-        <w:t>Industrial Electrical Engineer / Journeyman - Indiana</w:t>
-      </w:r>
-      <w:r>
-        <w:rPr>
-          <w:rFonts w:ascii="Aptos" w:hAnsi="Aptos"/>
-          <w:b w:val="0"/>
-          <w:i w:val="0"/>
-          <w:color w:val="262D34"/>
-          <w:sz w:val="18"/>
-        </w:rPr>
-        <w:t xml:space="preserve"> - Field execution, troubleshooting, physical systems, and safety-minded problem solving</w:t>
+        <w:t>Administered databases through phpMyAdmin and used AWS to back up database records and photographic images; handled recovery and access controls for business systems.</w:t>
       </w:r>
     </w:p>
     <w:p>
       <w:pPr>
-        <w:spacing w:before="160" w:after="60" w:line="240" w:lineRule="auto"/>
-        <w:pBdr>
-          <w:bottom w:val="single" w:sz="10" w:space="1" w:color="00707D"/>
-        </w:pBdr>
+        <w:pStyle w:val="Heading2"/>
       </w:pPr>
       <w:r>
-        <w:rPr>
-          <w:rFonts w:ascii="Aptos" w:hAnsi="Aptos"/>
-          <w:b/>
-          <w:i w:val="0"/>
-          <w:color w:val="00707D"/>
-          <w:sz w:val="21"/>
-        </w:rPr>
-        <w:t>SELECTED TOOLS</w:t>
+        <w:t>Smok'n Joe's Bar | Owner Manager</w:t>
       </w:r>
     </w:p>
     <w:p>
       <w:pPr>
-        <w:spacing w:before="0" w:after="60" w:line="252" w:lineRule="auto"/>
+        <w:keepNext/>
       </w:pPr>
       <w:r>
-        <w:rPr>
-          <w:rFonts w:ascii="Aptos" w:hAnsi="Aptos"/>
-          <w:b w:val="0"/>
-          <w:i w:val="0"/>
-          <w:color w:val="262D34"/>
-          <w:sz w:val="18"/>
-        </w:rPr>
-        <w:t>React, TypeScript, JavaScript, Node.js, Python, PostgreSQL, MySQL, SQL, Spark, Hive, AWS Lambda, API Gateway, DynamoDB, S3, Grafana, Tableau, Power BI, Google Apps Script, RAG, structured extraction, agent orchestration, evaluation, and red teaming.</w:t>
+        <w:t>Mar 2011 - Jan 2012</w:t>
       </w:r>
     </w:p>
     <w:p>
       <w:pPr>
-        <w:spacing w:before="160" w:after="60" w:line="240" w:lineRule="auto"/>
-        <w:pBdr>
-          <w:bottom w:val="single" w:sz="10" w:space="1" w:color="00707D"/>
-        </w:pBdr>
+        <w:pStyle w:val="ListBullet"/>
+        <w:spacing w:after="80"/>
       </w:pPr>
       <w:r>
-        <w:rPr>
-          <w:rFonts w:ascii="Aptos" w:hAnsi="Aptos"/>
-          <w:b/>
-          <w:i w:val="0"/>
-          <w:color w:val="00707D"/>
-          <w:sz w:val="21"/>
-        </w:rPr>
-        <w:t>PROFESSIONAL FOCUS</w:t>
+        <w:t>Administered a Linux-based POS system over SSH, including backup and recovery of transaction records; handled remote recovery for Linux-based security systems.</w:t>
       </w:r>
     </w:p>
     <w:p>
       <w:pPr>
-        <w:spacing w:before="0" w:after="0" w:line="252" w:lineRule="auto"/>
+        <w:pStyle w:val="Heading2"/>
       </w:pPr>
       <w:r>
-        <w:rPr>
-          <w:rFonts w:ascii="Aptos" w:hAnsi="Aptos"/>
-          <w:b w:val="0"/>
-          <w:i w:val="0"/>
-          <w:color w:val="262D34"/>
-          <w:sz w:val="18"/>
-        </w:rPr>
-        <w:t>AI integration, data reliability, analytics engineering, full-stack delivery, document intelligence, operational tooling, and workflow automation.</w:t>
+        <w:t>Vangent | Workforce Analyst</w:t>
+      </w:r>
+    </w:p>
+    <w:p>
+      <w:pPr>
+        <w:keepNext/>
+      </w:pPr>
+      <w:r>
+        <w:t>Apr 2008 - Jan 2011</w:t>
+      </w:r>
+    </w:p>
+    <w:p>
+      <w:pPr>
+        <w:pStyle w:val="ListBullet"/>
+        <w:spacing w:after="80"/>
+      </w:pPr>
+      <w:r>
+        <w:t>Analyzed workloads and staffing needs, built workforce forecasts, and supported operational reporting and contingency planning in government-contractor environments.</w:t>
+      </w:r>
+    </w:p>
+    <w:p>
+      <w:pPr>
+        <w:pStyle w:val="Heading2"/>
+      </w:pPr>
+      <w:r>
+        <w:t>Bank of America | Senior Operations Analyst</w:t>
+      </w:r>
+    </w:p>
+    <w:p>
+      <w:pPr>
+        <w:keepNext/>
+      </w:pPr>
+      <w:r>
+        <w:t>Jan 2003 - Feb 2008</w:t>
+      </w:r>
+    </w:p>
+    <w:p>
+      <w:pPr>
+        <w:pStyle w:val="ListBullet"/>
+        <w:spacing w:after="80"/>
+      </w:pPr>
+      <w:r>
+        <w:t>Analyzed operational performance, contact routing, workloads, and staffing to support forecasting, service delivery, and process improvements.</w:t>
       </w:r>
     </w:p>
     <w:sectPr>
-      <w:headerReference w:type="default" r:id="rId9"/>
-      <w:footerReference w:type="default" r:id="rId10"/>
       <w:pgSz w:w="12240" w:h="15840"/>
-      <w:pgMar w:top="792" w:right="936" w:bottom="792" w:left="936" w:header="360" w:footer="360" w:gutter="0"/>
+      <w:pgMar w:top="677" w:right="864" w:bottom="792" w:left="864" w:header="720" w:footer="720" w:gutter="0"/>
       <w:cols w:space="720"/>
       <w:docGrid w:linePitch="360"/>
     </w:sectPr>
   </w:body>
 </w:document>
-</file>
-
-<file path=word/footer1.xml><?xml version="1.0" encoding="utf-8"?>
-<w:ftr xmlns:m="http://schemas.openxmlformats.org/officeDocument/2006/math" xmlns:mc="http://schemas.openxmlformats.org/markup-compatibility/2006" xmlns:mo="http://schemas.microsoft.com/office/mac/office/2008/main" xmlns:mv="urn:schemas-microsoft-com:mac:vml" xmlns:o="urn:schemas-microsoft-com:office:office" xmlns:r="http://schemas.openxmlformats.org/officeDocument/2006/relationships" xmlns:v="urn:schemas-microsoft-com:vml" xmlns:w10="urn:schemas-microsoft-com:office:word" xmlns:w14="http://schemas.microsoft.com/office/word/2010/wordml" xmlns:w="http://schemas.openxmlformats.org/wordprocessingml/2006/main" xmlns:wne="http://schemas.microsoft.com/office/word/2006/wordml" xmlns:wp14="http://schemas.microsoft.com/office/word/2010/wordprocessingDrawing" xmlns:wp="http://schemas.openxmlformats.org/drawingml/2006/wordprocessingDrawing" xmlns:wpc="http://schemas.microsoft.com/office/word/2010/wordprocessingCanvas" xmlns:wpg="http://schemas.microsoft.com/office/word/2010/wordprocessingGroup" xmlns:wpi="http://schemas.microsoft.com/office/word/2010/wordprocessingInk" xmlns:wps="http://schemas.microsoft.com/office/word/2010/wordprocessingShape" mc:Ignorable="w14 wp14">
-  <w:p>
-    <w:pPr>
-      <w:pStyle w:val="Footer"/>
-      <w:spacing w:before="0" w:after="0" w:line="240" w:lineRule="auto"/>
-      <w:jc w:val="center"/>
-    </w:pPr>
-    <w:r>
-      <w:rPr>
-        <w:rFonts w:ascii="Aptos" w:hAnsi="Aptos"/>
-        <w:b w:val="0"/>
-        <w:i w:val="0"/>
-        <w:color w:val="5B6773"/>
-        <w:sz w:val="15"/>
-      </w:rPr>
-      <w:t>Richard Jones  |  RichardX13@gmail.com  |  LinkedIn: richardjones2020</w:t>
-    </w:r>
-  </w:p>
-</w:ftr>
-</file>
-
-<file path=word/header1.xml><?xml version="1.0" encoding="utf-8"?>
-<w:hdr xmlns:m="http://schemas.openxmlformats.org/officeDocument/2006/math" xmlns:mc="http://schemas.openxmlformats.org/markup-compatibility/2006" xmlns:mo="http://schemas.microsoft.com/office/mac/office/2008/main" xmlns:mv="urn:schemas-microsoft-com:mac:vml" xmlns:o="urn:schemas-microsoft-com:office:office" xmlns:r="http://schemas.openxmlformats.org/officeDocument/2006/relationships" xmlns:v="urn:schemas-microsoft-com:vml" xmlns:w10="urn:schemas-microsoft-com:office:word" xmlns:w14="http://schemas.microsoft.com/office/word/2010/wordml" xmlns:w="http://schemas.openxmlformats.org/wordprocessingml/2006/main" xmlns:wne="http://schemas.microsoft.com/office/word/2006/wordml" xmlns:wp14="http://schemas.microsoft.com/office/word/2010/wordprocessingDrawing" xmlns:wp="http://schemas.openxmlformats.org/drawingml/2006/wordprocessingDrawing" xmlns:wpc="http://schemas.microsoft.com/office/word/2010/wordprocessingCanvas" xmlns:wpg="http://schemas.microsoft.com/office/word/2010/wordprocessingGroup" xmlns:wpi="http://schemas.microsoft.com/office/word/2010/wordprocessingInk" xmlns:wps="http://schemas.microsoft.com/office/word/2010/wordprocessingShape" mc:Ignorable="w14 wp14">
-  <w:p>
-    <w:pPr>
-      <w:pStyle w:val="Header"/>
-      <w:spacing w:before="0" w:after="0" w:line="240" w:lineRule="auto"/>
-      <w:jc w:val="right"/>
-    </w:pPr>
-    <w:r>
-      <w:rPr>
-        <w:rFonts w:ascii="Aptos" w:hAnsi="Aptos"/>
-        <w:b/>
-        <w:i w:val="0"/>
-        <w:color w:val="5B6773"/>
-        <w:sz w:val="15"/>
-      </w:rPr>
-      <w:t>RICHARD JONES  |  DATA, AI, AND FULL-STACK ENGINEERING</w:t>
-    </w:r>
-  </w:p>
-</w:hdr>
 </file>
 
 <file path=word/numbering.xml><?xml version="1.0" encoding="utf-8"?>
@@ -1128,12 +778,11 @@
     <w:qFormat/>
     <w:rsid w:val="00FC693F"/>
     <w:pPr>
-      <w:spacing w:after="80" w:line="252" w:lineRule="auto"/>
+      <w:spacing w:after="80" w:line="240" w:lineRule="auto"/>
     </w:pPr>
     <w:rPr>
-      <w:rFonts w:ascii="Aptos" w:hAnsi="Aptos"/>
-      <w:color w:val="262D34"/>
-      <w:sz w:val="19"/>
+      <w:rFonts w:ascii="Calibri" w:hAnsi="Calibri"/>
+      <w:sz w:val="20"/>
     </w:rPr>
   </w:style>
   <w:style w:type="paragraph" w:styleId="Header">
@@ -1191,15 +840,15 @@
     <w:pPr>
       <w:keepNext/>
       <w:keepLines/>
-      <w:spacing w:before="480" w:after="0"/>
+      <w:spacing w:before="140" w:after="80"/>
       <w:outlineLvl w:val="0"/>
     </w:pPr>
     <w:rPr>
-      <w:rFonts w:asciiTheme="majorHAnsi" w:eastAsiaTheme="majorEastAsia" w:hAnsiTheme="majorHAnsi" w:cstheme="majorBidi"/>
+      <w:rFonts w:asciiTheme="majorHAnsi" w:eastAsiaTheme="majorEastAsia" w:hAnsiTheme="majorHAnsi" w:cstheme="majorBidi" w:ascii="Calibri" w:hAnsi="Calibri"/>
       <w:b/>
       <w:bCs/>
-      <w:color w:val="365F91" w:themeColor="accent1" w:themeShade="BF"/>
-      <w:sz w:val="28"/>
+      <w:color w:val="000000"/>
+      <w:sz w:val="22"/>
       <w:szCs w:val="28"/>
     </w:rPr>
   </w:style>
@@ -1215,15 +864,15 @@
     <w:pPr>
       <w:keepNext/>
       <w:keepLines/>
-      <w:spacing w:before="200" w:after="0"/>
+      <w:spacing w:before="140" w:after="80"/>
       <w:outlineLvl w:val="1"/>
     </w:pPr>
     <w:rPr>
-      <w:rFonts w:asciiTheme="majorHAnsi" w:eastAsiaTheme="majorEastAsia" w:hAnsiTheme="majorHAnsi" w:cstheme="majorBidi"/>
+      <w:rFonts w:asciiTheme="majorHAnsi" w:eastAsiaTheme="majorEastAsia" w:hAnsiTheme="majorHAnsi" w:cstheme="majorBidi" w:ascii="Calibri" w:hAnsi="Calibri"/>
       <w:b/>
       <w:bCs/>
-      <w:color w:val="4F81BD" w:themeColor="accent1"/>
-      <w:sz w:val="26"/>
+      <w:color w:val="000000"/>
+      <w:sz w:val="20"/>
       <w:szCs w:val="26"/>
     </w:rPr>
   </w:style>
@@ -1480,15 +1129,15 @@
       <w:pBdr>
         <w:bottom w:val="single" w:sz="8" w:space="4" w:color="4F81BD" w:themeColor="accent1"/>
       </w:pBdr>
-      <w:spacing w:after="300" w:line="240" w:lineRule="auto"/>
+      <w:spacing w:after="80" w:line="240" w:lineRule="auto" w:before="140"/>
       <w:contextualSpacing/>
     </w:pPr>
     <w:rPr>
-      <w:rFonts w:asciiTheme="majorHAnsi" w:eastAsiaTheme="majorEastAsia" w:hAnsiTheme="majorHAnsi" w:cstheme="majorBidi"/>
-      <w:color w:val="17365D" w:themeColor="text2" w:themeShade="BF"/>
+      <w:rFonts w:asciiTheme="majorHAnsi" w:eastAsiaTheme="majorEastAsia" w:hAnsiTheme="majorHAnsi" w:cstheme="majorBidi" w:ascii="Calibri" w:hAnsi="Calibri"/>
+      <w:color w:val="000000"/>
       <w:spacing w:val="5"/>
       <w:kern w:val="28"/>
-      <w:sz w:val="52"/>
+      <w:sz w:val="46"/>
       <w:szCs w:val="52"/>
     </w:rPr>
   </w:style>
@@ -12817,25 +12466,6 @@
         <w:shd w:val="clear" w:color="auto" w:fill="FBCAA2" w:themeFill="accent6" w:themeFillTint="7F"/>
       </w:tcPr>
     </w:tblStylePr>
-  </w:style>
-  <w:style w:type="paragraph" w:customStyle="1" w:styleId="ResumeBullet">
-    <w:name w:val="Resume Bullet"/>
-    <w:basedOn w:val="Normal"/>
-    <w:pPr>
-      <w:tabs>
-        <w:tab w:pos="259" w:val="left"/>
-      </w:tabs>
-      <w:spacing w:after="30" w:line="240" w:lineRule="auto"/>
-      <w:ind w:left="259" w:hanging="173"/>
-      <w:numPr>
-        <w:ilvl w:val="0"/>
-        <w:numId w:val="1"/>
-      </w:numPr>
-    </w:pPr>
-    <w:rPr>
-      <w:rFonts w:ascii="Aptos" w:hAnsi="Aptos"/>
-      <w:sz w:val="18"/>
-    </w:rPr>
   </w:style>
 </w:styles>
 </file>

</xml_diff>

<commit_message>
Improve resume pagination with contract work starting page two
</commit_message>
<xml_diff>
--- a/Richard-Jones-resume.docx
+++ b/Richard-Jones-resume.docx
@@ -186,6 +186,11 @@
       </w:r>
     </w:p>
     <w:p>
+      <w:r>
+        <w:br w:type="page"/>
+      </w:r>
+    </w:p>
+    <w:p>
       <w:pPr>
         <w:pStyle w:val="Heading1"/>
       </w:pPr>
@@ -196,11 +201,6 @@
     <w:p>
       <w:r>
         <w:t>Configured GCP IAM permissions and application access restrictions for a recent Moody Goose contract sprint supporting driver credential verification.</w:t>
-      </w:r>
-    </w:p>
-    <w:p>
-      <w:r>
-        <w:br w:type="page"/>
       </w:r>
     </w:p>
     <w:p>

</xml_diff>